<commit_message>
feat(demo): expression conditionals, worked examples page and Playwright screenshots
/conditionals evaluates expression blocks of the template next to the named
ones; /conditionals/examples shows Word text, PHP context and result with
template and generated .docx downloads. Playwright e2e, page screenshots and
LibreOffice-rendered template vs result previews (make docx-previews).
</commit_message>
<xml_diff>
--- a/demo/symfony8/public/demo/conditionals-tpl.docx
+++ b/demo/symfony8/public/demo/conditionals-tpl.docx
@@ -648,6 +648,216 @@
       <w:r>
         <w:rPr/>
         <w:t xml:space="preserve">${#endif plan_other}</w:t>
+      </w:r>
+    </w:p>
+    <w:p>
+      <w:pPr>
+        <w:pStyle w:val="Heading2"/>
+      </w:pPr>
+      <w:bookmarkStart w:id="9" w:name="_Toc9"/>
+      <w:r>
+        <w:t>Expression conditionals — decided in the template (bundle 1.8)</w:t>
+      </w:r>
+      <w:bookmarkEnd w:id="9"/>
+    </w:p>
+    <w:p>
+      <w:pPr/>
+      <w:r>
+        <w:rPr>
+          <w:color w:val="4A5568"/>
+          <w:i w:val="1"/>
+          <w:iCs w:val="1"/>
+        </w:rPr>
+        <w:t xml:space="preserve">Each block below ends with a nameless end marker (#endif without a name): the condition is evaluated by the bundle against the "order" values of the context (config conditional_expressions.enabled: true).</w:t>
+      </w:r>
+    </w:p>
+    <w:p>
+      <w:pPr/>
+      <w:r>
+        <w:rPr/>
+        <w:t xml:space="preserve">${#if order.total &gt; 100}</w:t>
+      </w:r>
+    </w:p>
+    <w:p>
+      <w:pPr/>
+      <w:r>
+        <w:rPr/>
+        <w:t xml:space="preserve">Large order (over 100 EUR): shipping is free.</w:t>
+      </w:r>
+    </w:p>
+    <w:p>
+      <w:pPr/>
+      <w:r>
+        <w:rPr/>
+        <w:t xml:space="preserve">${#endif}</w:t>
+      </w:r>
+    </w:p>
+    <w:p>
+      <w:pPr/>
+      <w:r>
+        <w:rPr/>
+        <w:t xml:space="preserve">${#if order.is_vip and upper(order.country) == 'ES'}</w:t>
+      </w:r>
+    </w:p>
+    <w:p>
+      <w:pPr/>
+      <w:r>
+        <w:rPr/>
+        <w:t xml:space="preserve">Spanish VIP customer: a personal account manager will call you.</w:t>
+      </w:r>
+    </w:p>
+    <w:p>
+      <w:pPr/>
+      <w:r>
+        <w:rPr/>
+        <w:t xml:space="preserve">${#endif}</w:t>
+      </w:r>
+    </w:p>
+    <w:p>
+      <w:pPr/>
+      <w:r>
+        <w:rPr/>
+        <w:t xml:space="preserve">${#if order.status in ['draft', 'overdue']}</w:t>
+      </w:r>
+    </w:p>
+    <w:p>
+      <w:pPr/>
+      <w:r>
+        <w:rPr/>
+        <w:t xml:space="preserve">Reminder: this invoice is not paid yet.</w:t>
+      </w:r>
+    </w:p>
+    <w:p>
+      <w:pPr/>
+      <w:r>
+        <w:rPr/>
+        <w:t xml:space="preserve">${#endif}</w:t>
+      </w:r>
+    </w:p>
+    <w:p>
+      <w:pPr/>
+      <w:r>
+        <w:rPr/>
+        <w:t xml:space="preserve">${#if order.due_date != null and order.due_date &lt; now() and order.status != 'paid'}</w:t>
+      </w:r>
+    </w:p>
+    <w:p>
+      <w:pPr/>
+      <w:r>
+        <w:rPr/>
+        <w:t xml:space="preserve">Overdue: the due date has passed.</w:t>
+      </w:r>
+    </w:p>
+    <w:p>
+      <w:pPr/>
+      <w:r>
+        <w:rPr/>
+        <w:t xml:space="preserve">${#endif}</w:t>
+      </w:r>
+    </w:p>
+    <w:p>
+      <w:pPr/>
+      <w:r>
+        <w:rPr/>
+        <w:t xml:space="preserve">${#if (order.discount ?? 0) &gt; 0}</w:t>
+      </w:r>
+    </w:p>
+    <w:p>
+      <w:pPr/>
+      <w:r>
+        <w:rPr/>
+        <w:t xml:space="preserve">A discount applies to this order.</w:t>
+      </w:r>
+    </w:p>
+    <w:p>
+      <w:pPr/>
+      <w:r>
+        <w:rPr/>
+        <w:t xml:space="preserve">${#endif}</w:t>
+      </w:r>
+    </w:p>
+    <w:p>
+      <w:pPr/>
+      <w:r>
+        <w:rPr/>
+        <w:t xml:space="preserve">${#if length(order.lines) &gt; 1}</w:t>
+      </w:r>
+    </w:p>
+    <w:p>
+      <w:pPr/>
+      <w:r>
+        <w:rPr/>
+        <w:t xml:space="preserve">Several order lines: they ship together.</w:t>
+      </w:r>
+    </w:p>
+    <w:p>
+      <w:pPr/>
+      <w:r>
+        <w:rPr/>
+        <w:t xml:space="preserve">${#endif}</w:t>
+      </w:r>
+    </w:p>
+    <w:p>
+      <w:pPr/>
+      <w:r>
+        <w:rPr/>
+        <w:t xml:space="preserve">${#if trim(default(order.notes, '')) != ''}</w:t>
+      </w:r>
+    </w:p>
+    <w:p>
+      <w:pPr/>
+      <w:r>
+        <w:rPr/>
+        <w:t xml:space="preserve">The customer left notes.</w:t>
+      </w:r>
+    </w:p>
+    <w:p>
+      <w:pPr/>
+      <w:r>
+        <w:rPr/>
+        <w:t xml:space="preserve">${#endif}</w:t>
+      </w:r>
+    </w:p>
+    <w:p>
+      <w:pPr/>
+      <w:r>
+        <w:rPr/>
+        <w:t xml:space="preserve">${#if order.plan == 'pro'}</w:t>
+      </w:r>
+    </w:p>
+    <w:p>
+      <w:pPr/>
+      <w:r>
+        <w:rPr/>
+        <w:t xml:space="preserve">Pro plan: 24/7 support.</w:t>
+      </w:r>
+    </w:p>
+    <w:p>
+      <w:pPr/>
+      <w:r>
+        <w:rPr/>
+        <w:t xml:space="preserve">${#endif}</w:t>
+      </w:r>
+    </w:p>
+    <w:p>
+      <w:pPr/>
+      <w:r>
+        <w:rPr/>
+        <w:t xml:space="preserve">${#if order.plan != 'pro'}</w:t>
+      </w:r>
+    </w:p>
+    <w:p>
+      <w:pPr/>
+      <w:r>
+        <w:rPr/>
+        <w:t xml:space="preserve">Upgrade to Pro for 24/7 support.</w:t>
+      </w:r>
+    </w:p>
+    <w:p>
+      <w:pPr/>
+      <w:r>
+        <w:rPr/>
+        <w:t xml:space="preserve">${#endif}</w:t>
       </w:r>
     </w:p>
     <w:sectPr>

</xml_diff>